<commit_message>
Localize CAS Activities Finder for GMIS and Jakarta IBDP schools
- Demo data: Gandhi Memorial International School (Jakarta Pusat) and
  Senayan IB Academy (Jakarta Selatan), Indonesian/Indian names, local
  projects (Ancol clean-up, batik mural, futsal league, panti werdha visit,
  mangrove planting at Angke Kapuk)
- Fees in Indonesian Rupiah (Rp format, Rp 10.000.000 limit)
- Schools belong to a validated Jabodetabek area; search matches area
  names; dates use local WIB time
- Wireframes, screenshots, test figure, Criteria C/D, success criteria,
  walkthrough and Word export updated; new tests for area and fee rules

Co-Authored-By: Claude Opus 5.5 <noreply@anthropic.com>
Claude-Session: https://claude.ai/code/session_01H9Fh8kikc4f3F12t1XDvQH
</commit_message>
<xml_diff>
--- a/docs/IA_Criteria_C_and_D.docx
+++ b/docs/IA_Criteria_C_and_D.docx
@@ -7,7 +7,7 @@
         <w:pStyle w:val="Title"/>
       </w:pPr>
       <w:r>
-        <w:t xml:space="preserve">CAS Activities Finder: Criteria C and D</w:t>
+        <w:t xml:space="preserve">CAS Activities Finder (GMIS Jakarta): Criteria C and D</w:t>
       </w:r>
     </w:p>
     <w:bookmarkStart w:id="63" w:name="criterion-c-system-overview"/>
@@ -45,7 +45,7 @@
         <w:pStyle w:val="FirstParagraph"/>
       </w:pPr>
       <w:r>
-        <w:t xml:space="preserve">The product is a three-tier JavaScript web application (Figure C1). The browser shows a single page whose screens are drawn by</w:t>
+        <w:t xml:space="preserve">The product is a three-tier JavaScript web application (Figure C1). It is designed for IBDP schools in Jakarta, starting with GMIS. The browser shows a single page whose screens are drawn by</w:t>
       </w:r>
       <w:r>
         <w:t xml:space="preserve"> </w:t>
@@ -820,7 +820,7 @@
       <w:r>
         <w:drawing>
           <wp:inline>
-            <wp:extent cx="5334000" cy="3057973"/>
+            <wp:extent cx="5334000" cy="3560654"/>
             <wp:effectExtent b="0" l="0" r="0" t="0"/>
             <wp:docPr descr="W1" title="" id="44" name="Picture"/>
             <a:graphic>
@@ -841,7 +841,7 @@
                   <pic:spPr bwMode="auto">
                     <a:xfrm>
                       <a:off x="0" y="0"/>
-                      <a:ext cx="5334000" cy="3057973"/>
+                      <a:ext cx="5334000" cy="3560654"/>
                     </a:xfrm>
                     <a:prstGeom prst="rect">
                       <a:avLst/>
@@ -865,7 +865,7 @@
       <w:r>
         <w:drawing>
           <wp:inline>
-            <wp:extent cx="5334000" cy="2771725"/>
+            <wp:extent cx="5334000" cy="3023065"/>
             <wp:effectExtent b="0" l="0" r="0" t="0"/>
             <wp:docPr descr="W2" title="" id="47" name="Picture"/>
             <a:graphic>
@@ -886,7 +886,7 @@
                   <pic:spPr bwMode="auto">
                     <a:xfrm>
                       <a:off x="0" y="0"/>
-                      <a:ext cx="5334000" cy="2771725"/>
+                      <a:ext cx="5334000" cy="3023065"/>
                     </a:xfrm>
                     <a:prstGeom prst="rect">
                       <a:avLst/>
@@ -910,7 +910,7 @@
       <w:r>
         <w:drawing>
           <wp:inline>
-            <wp:extent cx="5334000" cy="2632091"/>
+            <wp:extent cx="5334000" cy="2757761"/>
             <wp:effectExtent b="0" l="0" r="0" t="0"/>
             <wp:docPr descr="W3" title="" id="50" name="Picture"/>
             <a:graphic>
@@ -931,7 +931,7 @@
                   <pic:spPr bwMode="auto">
                     <a:xfrm>
                       <a:off x="0" y="0"/>
-                      <a:ext cx="5334000" cy="2632091"/>
+                      <a:ext cx="5334000" cy="2757761"/>
                     </a:xfrm>
                     <a:prstGeom prst="rect">
                       <a:avLst/>
@@ -955,7 +955,7 @@
       <w:r>
         <w:drawing>
           <wp:inline>
-            <wp:extent cx="5334000" cy="3092882"/>
+            <wp:extent cx="5334000" cy="3330259"/>
             <wp:effectExtent b="0" l="0" r="0" t="0"/>
             <wp:docPr descr="W4" title="" id="53" name="Picture"/>
             <a:graphic>
@@ -976,7 +976,7 @@
                   <pic:spPr bwMode="auto">
                     <a:xfrm>
                       <a:off x="0" y="0"/>
-                      <a:ext cx="5334000" cy="3092882"/>
+                      <a:ext cx="5334000" cy="3330259"/>
                     </a:xfrm>
                     <a:prstGeom prst="rect">
                       <a:avLst/>
@@ -1045,7 +1045,7 @@
       <w:r>
         <w:drawing>
           <wp:inline>
-            <wp:extent cx="5334000" cy="2687945"/>
+            <wp:extent cx="5334000" cy="3288369"/>
             <wp:effectExtent b="0" l="0" r="0" t="0"/>
             <wp:docPr descr="W6" title="" id="59" name="Picture"/>
             <a:graphic>
@@ -1066,7 +1066,7 @@
                   <pic:spPr bwMode="auto">
                     <a:xfrm>
                       <a:off x="0" y="0"/>
-                      <a:ext cx="5334000" cy="2687945"/>
+                      <a:ext cx="5334000" cy="3288369"/>
                     </a:xfrm>
                     <a:prstGeom prst="rect">
                       <a:avLst/>
@@ -1361,7 +1361,7 @@
               <w:jc w:val="left"/>
             </w:pPr>
             <w:r>
-              <w:t xml:space="preserve">title 4/5/80/81 chars; deadline yesterday/today/after start; hours 0/4.5/200; empty form</w:t>
+              <w:t xml:space="preserve">title 4/5/80/81 chars; deadline yesterday/today/after start; hours 0/4.5/200; fee Rp 10.000.000/10.000.001; empty form</w:t>
             </w:r>
           </w:p>
         </w:tc>
@@ -1598,6 +1598,18 @@
               <w:rPr>
                 <w:rStyle w:val="VerbatimChar"/>
               </w:rPr>
+              <w:t xml:space="preserve">jakarta selatan</w:t>
+            </w:r>
+            <w:r>
+              <w:t xml:space="preserve">,</w:t>
+            </w:r>
+            <w:r>
+              <w:t xml:space="preserve"> </w:t>
+            </w:r>
+            <w:r>
+              <w:rPr>
+                <w:rStyle w:val="VerbatimChar"/>
+              </w:rPr>
               <w:t xml:space="preserve">skydiving</w:t>
             </w:r>
             <w:r>
@@ -1613,7 +1625,7 @@
               <w:jc w:val="left"/>
             </w:pPr>
             <w:r>
-              <w:t xml:space="preserve">title match first; matched; none; all</w:t>
+              <w:t xml:space="preserve">title match first; matched; Senayan futsal only; none; all</w:t>
             </w:r>
           </w:p>
         </w:tc>
@@ -1973,19 +1985,28 @@
               <w:jc w:val="left"/>
             </w:pPr>
             <w:r>
-              <w:t xml:space="preserve">add duplicate ID; remove student; replace principal</w:t>
-            </w:r>
-          </w:p>
-        </w:tc>
-        <w:tc>
-          <w:tcPr/>
-          <w:p>
-            <w:pPr>
-              <w:pStyle w:val="Compact"/>
-              <w:jc w:val="left"/>
-            </w:pPr>
-            <w:r>
-              <w:t xml:space="preserve">409; old cookie 401; old principal refused</w:t>
+              <w:t xml:space="preserve">add duplicate ID; remove student; replace principal; school area</w:t>
+            </w:r>
+            <w:r>
+              <w:t xml:space="preserve"> </w:t>
+            </w:r>
+            <w:r>
+              <w:rPr>
+                <w:rStyle w:val="VerbatimChar"/>
+              </w:rPr>
+              <w:t xml:space="preserve">Mumbai</w:t>
+            </w:r>
+          </w:p>
+        </w:tc>
+        <w:tc>
+          <w:tcPr/>
+          <w:p>
+            <w:pPr>
+              <w:pStyle w:val="Compact"/>
+              <w:jc w:val="left"/>
+            </w:pPr>
+            <w:r>
+              <w:t xml:space="preserve">409; old cookie 401; old principal refused; 400</w:t>
             </w:r>
           </w:p>
         </w:tc>
@@ -4824,7 +4845,7 @@
         <w:t xml:space="preserve"> </w:t>
       </w:r>
       <w:r>
-        <w:t xml:space="preserve">collects all errors, so a student fixes the form in one attempt. The server re-checks everything: with the browser’s checks disabled, the bad form was still refused.</w:t>
+        <w:t xml:space="preserve">collects all errors, so a student fixes the form in one attempt. School areas are checked against a fixed list of Jabodetabek areas, and fees against a Rupiah limit. The server re-checks everything: with the browser’s checks disabled, the bad form was still refused.</w:t>
       </w:r>
     </w:p>
     <w:bookmarkEnd w:id="83"/>
@@ -5234,7 +5255,22 @@
         <w:t xml:space="preserve"> </w:t>
       </w:r>
       <w:r>
-        <w:t xml:space="preserve">helper, so the server’s reason always reaches the user. Text written by users passes through</w:t>
+        <w:t xml:space="preserve">helper, so the server’s reason always reaches the user. Fees are shown in Indonesian format with</w:t>
+      </w:r>
+      <w:r>
+        <w:t xml:space="preserve"> </w:t>
+      </w:r>
+      <w:r>
+        <w:rPr>
+          <w:rStyle w:val="VerbatimChar"/>
+        </w:rPr>
+        <w:t xml:space="preserve">toLocaleString('id-ID')</w:t>
+      </w:r>
+      <w:r>
+        <w:t xml:space="preserve"> </w:t>
+      </w:r>
+      <w:r>
+        <w:t xml:space="preserve">(Rp 50.000), and dates use local WIB time instead of UTC. Text written by users passes through</w:t>
       </w:r>
       <w:r>
         <w:t xml:space="preserve"> </w:t>
@@ -5475,7 +5511,7 @@
               <w:jc w:val="left"/>
             </w:pPr>
             <w:r>
-              <w:t xml:space="preserve">a slow query would block others; measured ≤ 60 ms</w:t>
+              <w:t xml:space="preserve">a slow query would block others; measured ≤ 65 ms</w:t>
             </w:r>
           </w:p>
         </w:tc>
@@ -5742,7 +5778,7 @@
         <w:t xml:space="preserve"> </w:t>
       </w:r>
       <w:r>
-        <w:t xml:space="preserve">Searching 2,006 projects took 51 ms over HTTP. The algorithm alone took 46 ms for 20,000 projects: an O(n) scan plus an O(k log k) sort of the k matches.</w:t>
+        <w:t xml:space="preserve">Searching 2,006 projects took 60 ms over HTTP. The algorithm alone took 63 ms for 20,000 projects: an O(n) scan plus an O(k log k) sort of the k matches.</w:t>
       </w:r>
     </w:p>
     <w:p>

</xml_diff>

<commit_message>
Switch to MySQL, set GMIS principal, simplify code comments and guide
- Database moved from SQLite to MySQL (mysql2): async queries, MySQL
  schema with ENUM/DATE types, connection settings in config.js
- Accepting a join request runs in a transaction with SELECT ... FOR
  UPDATE; new test T30 shows concurrent acceptances cannot overbook
- Tests create and drop their own temporary MySQL databases
- GMIS principal in demo data is Dr. Manish Semwal
- Code comments trimmed to short, normal-density notes; README shortened
- Study guide rewritten in simpler language with function names instead
  of line numbers; Criteria C/D, diagrams, screenshots and Word file
  updated for MySQL

Co-Authored-By: Claude Opus 5.5 <noreply@anthropic.com>
Claude-Session: https://claude.ai/code/session_01H9Fh8kikc4f3F12t1XDvQH
</commit_message>
<xml_diff>
--- a/docs/IA_Criteria_C_and_D.docx
+++ b/docs/IA_Criteria_C_and_D.docx
@@ -57,7 +57,7 @@
         <w:t xml:space="preserve">app.js</w:t>
       </w:r>
       <w:r>
-        <w:t xml:space="preserve">. The Express server authenticates each request, applies the rules, and is the only tier that touches the SQLite database (Figure C2). Rules are kept in pure-function modules (Figure C3) so that each one can be tested on its own.</w:t>
+        <w:t xml:space="preserve">. The Express server authenticates each request, applies the rules, and is the only tier that touches the MySQL database (Figure C2). Rules are kept in pure-function modules (Figure C3) so that each one can be tested on its own.</w:t>
       </w:r>
     </w:p>
     <w:p>
@@ -124,7 +124,7 @@
       <w:r>
         <w:drawing>
           <wp:inline>
-            <wp:extent cx="4940628" cy="7589520"/>
+            <wp:extent cx="5142287" cy="7589520"/>
             <wp:effectExtent b="0" l="0" r="0" t="0"/>
             <wp:docPr descr="Figure C2 – Entity-relationship diagram" title="" id="24" name="Picture"/>
             <a:graphic>
@@ -145,7 +145,7 @@
                   <pic:spPr bwMode="auto">
                     <a:xfrm>
                       <a:off x="0" y="0"/>
-                      <a:ext cx="4940628" cy="7589520"/>
+                      <a:ext cx="5142287" cy="7589520"/>
                     </a:xfrm>
                     <a:prstGeom prst="rect">
                       <a:avLst/>
@@ -1825,7 +1825,7 @@
               <w:jc w:val="left"/>
             </w:pPr>
             <w:r>
-              <w:t xml:space="preserve">T23</w:t>
+              <w:t xml:space="preserve">T23, T30</w:t>
             </w:r>
           </w:p>
         </w:tc>
@@ -1861,7 +1861,7 @@
               <w:jc w:val="left"/>
             </w:pPr>
             <w:r>
-              <w:t xml:space="preserve">2 requests, 1 place; non-creator decides</w:t>
+              <w:t xml:space="preserve">2 requests, 1 place (one after another, then at the same moment); non-creator decides</w:t>
             </w:r>
           </w:p>
         </w:tc>
@@ -2189,7 +2189,7 @@
               <w:jc w:val="left"/>
             </w:pPr>
             <w:r>
-              <w:t xml:space="preserve">restart server on the same file</w:t>
+              <w:t xml:space="preserve">restart server on the same MySQL database</w:t>
             </w:r>
           </w:p>
         </w:tc>
@@ -2249,7 +2249,7 @@
         <w:pStyle w:val="FirstParagraph"/>
       </w:pPr>
       <w:r>
-        <w:t xml:space="preserve">All ten success criteria work and are shown in the video. The 29 automated tests all pass (Figure D1).</w:t>
+        <w:t xml:space="preserve">All ten success criteria work and are shown in the video. The 30 automated tests all pass (Figure D1).</w:t>
       </w:r>
     </w:p>
     <w:tbl>
@@ -2557,7 +2557,7 @@
               <w:jc w:val="left"/>
             </w:pPr>
             <w:r>
-              <w:t xml:space="preserve">T23</w:t>
+              <w:t xml:space="preserve">T23, T30</w:t>
             </w:r>
           </w:p>
         </w:tc>
@@ -2797,13 +2797,13 @@
         <w:t xml:space="preserve">D2. Techniques</w:t>
       </w:r>
     </w:p>
-    <w:bookmarkStart w:id="78" w:name="X86b7295d9564aa76cd68b996e49a29296a1c25b"/>
+    <w:bookmarkStart w:id="78" w:name="X879b6aab8f1e4e7b21c36b09f65fec94d6f014c"/>
     <w:p>
       <w:pPr>
         <w:pStyle w:val="Heading3"/>
       </w:pPr>
       <w:r>
-        <w:t xml:space="preserve">1. Relational database with constraints and parameterised SQL</w:t>
+        <w:t xml:space="preserve">1. MySQL database with constraints, parameterised SQL and transactions</w:t>
       </w:r>
     </w:p>
     <w:p>
@@ -2814,31 +2814,19 @@
         <w:rPr>
           <w:rStyle w:val="NormalTok"/>
         </w:rPr>
-        <w:t xml:space="preserve">role   TEXT NOT NULL </w:t>
+        <w:t xml:space="preserve">role </w:t>
       </w:r>
       <w:r>
         <w:rPr>
           <w:rStyle w:val="FunctionTok"/>
         </w:rPr>
-        <w:t xml:space="preserve">CHECK</w:t>
-      </w:r>
-      <w:r>
-        <w:rPr>
-          <w:rStyle w:val="NormalTok"/>
-        </w:rPr>
-        <w:t xml:space="preserve"> (role </w:t>
-      </w:r>
-      <w:r>
-        <w:rPr>
-          <w:rStyle w:val="FunctionTok"/>
-        </w:rPr>
-        <w:t xml:space="preserve">IN</w:t>
-      </w:r>
-      <w:r>
-        <w:rPr>
-          <w:rStyle w:val="NormalTok"/>
-        </w:rPr>
-        <w:t xml:space="preserve"> (</w:t>
+        <w:t xml:space="preserve">ENUM</w:t>
+      </w:r>
+      <w:r>
+        <w:rPr>
+          <w:rStyle w:val="NormalTok"/>
+        </w:rPr>
+        <w:t xml:space="preserve">(</w:t>
       </w:r>
       <w:r>
         <w:rPr>
@@ -2886,7 +2874,7 @@
         <w:rPr>
           <w:rStyle w:val="NormalTok"/>
         </w:rPr>
-        <w:t xml:space="preserve">))</w:t>
+        <w:t xml:space="preserve">) NOT NULL</w:t>
       </w:r>
       <w:r>
         <w:rPr>
@@ -3053,7 +3041,7 @@
         <w:rPr>
           <w:rStyle w:val="VerbatimChar"/>
         </w:rPr>
-        <w:t xml:space="preserve">CHECK</w:t>
+        <w:t xml:space="preserve">ENUM</w:t>
       </w:r>
       <w:r>
         <w:t xml:space="preserve"> </w:t>
@@ -5449,31 +5437,40 @@
               <w:jc w:val="left"/>
             </w:pPr>
             <w:r>
-              <w:t xml:space="preserve">SQLite built into Node</w:t>
-            </w:r>
-          </w:p>
-        </w:tc>
-        <w:tc>
-          <w:tcPr/>
-          <w:p>
-            <w:pPr>
-              <w:pStyle w:val="Compact"/>
-              <w:jc w:val="left"/>
-            </w:pPr>
-            <w:r>
-              <w:t xml:space="preserve">no server to install; constraints, joins</w:t>
-            </w:r>
-          </w:p>
-        </w:tc>
-        <w:tc>
-          <w:tcPr/>
-          <w:p>
-            <w:pPr>
-              <w:pStyle w:val="Compact"/>
-              <w:jc w:val="left"/>
-            </w:pPr>
-            <w:r>
-              <w:t xml:space="preserve">one writer at a time; PostgreSQL needed for city-wide use</w:t>
+              <w:t xml:space="preserve">MySQL</w:t>
+            </w:r>
+          </w:p>
+        </w:tc>
+        <w:tc>
+          <w:tcPr/>
+          <w:p>
+            <w:pPr>
+              <w:pStyle w:val="Compact"/>
+              <w:jc w:val="left"/>
+            </w:pPr>
+            <w:r>
+              <w:t xml:space="preserve">handles many users at once; constraints, joins, transactions</w:t>
+            </w:r>
+          </w:p>
+        </w:tc>
+        <w:tc>
+          <w:tcPr/>
+          <w:p>
+            <w:pPr>
+              <w:pStyle w:val="Compact"/>
+              <w:jc w:val="left"/>
+            </w:pPr>
+            <w:r>
+              <w:t xml:space="preserve">must be installed and running; the login is set in</w:t>
+            </w:r>
+            <w:r>
+              <w:t xml:space="preserve"> </w:t>
+            </w:r>
+            <w:r>
+              <w:rPr>
+                <w:rStyle w:val="VerbatimChar"/>
+              </w:rPr>
+              <w:t xml:space="preserve">config.js</w:t>
             </w:r>
           </w:p>
         </w:tc>
@@ -5487,31 +5484,46 @@
               <w:jc w:val="left"/>
             </w:pPr>
             <w:r>
-              <w:t xml:space="preserve">Synchronous queries</w:t>
-            </w:r>
-          </w:p>
-        </w:tc>
-        <w:tc>
-          <w:tcPr/>
-          <w:p>
-            <w:pPr>
-              <w:pStyle w:val="Compact"/>
-              <w:jc w:val="left"/>
-            </w:pPr>
-            <w:r>
-              <w:t xml:space="preserve">a capacity check and the following insert can’t interleave, which prevents overbooking (T23)</w:t>
-            </w:r>
-          </w:p>
-        </w:tc>
-        <w:tc>
-          <w:tcPr/>
-          <w:p>
-            <w:pPr>
-              <w:pStyle w:val="Compact"/>
-              <w:jc w:val="left"/>
-            </w:pPr>
-            <w:r>
-              <w:t xml:space="preserve">a slow query would block others; measured ≤ 65 ms</w:t>
+              <w:t xml:space="preserve">Transaction with</w:t>
+            </w:r>
+            <w:r>
+              <w:t xml:space="preserve"> </w:t>
+            </w:r>
+            <w:r>
+              <w:rPr>
+                <w:rStyle w:val="VerbatimChar"/>
+              </w:rPr>
+              <w:t xml:space="preserve">SELECT … FOR UPDATE</w:t>
+            </w:r>
+            <w:r>
+              <w:t xml:space="preserve"> </w:t>
+            </w:r>
+            <w:r>
+              <w:t xml:space="preserve">when accepting</w:t>
+            </w:r>
+          </w:p>
+        </w:tc>
+        <w:tc>
+          <w:tcPr/>
+          <w:p>
+            <w:pPr>
+              <w:pStyle w:val="Compact"/>
+              <w:jc w:val="left"/>
+            </w:pPr>
+            <w:r>
+              <w:t xml:space="preserve">locks the project row, so two acceptances can’t both take the last place (T30)</w:t>
+            </w:r>
+          </w:p>
+        </w:tc>
+        <w:tc>
+          <w:tcPr/>
+          <w:p>
+            <w:pPr>
+              <w:pStyle w:val="Compact"/>
+              <w:jc w:val="left"/>
+            </w:pPr>
+            <w:r>
+              <w:t xml:space="preserve">the second request waits briefly for the lock</w:t>
             </w:r>
           </w:p>
         </w:tc>
@@ -5648,7 +5660,7 @@
       <w:r>
         <w:drawing>
           <wp:inline>
-            <wp:extent cx="5334000" cy="5305815"/>
+            <wp:extent cx="5334000" cy="5432647"/>
             <wp:effectExtent b="0" l="0" r="0" t="0"/>
             <wp:docPr descr="Figure D1 – test run" title="" id="89" name="Picture"/>
             <a:graphic>
@@ -5669,7 +5681,7 @@
                   <pic:spPr bwMode="auto">
                     <a:xfrm>
                       <a:off x="0" y="0"/>
-                      <a:ext cx="5334000" cy="5305815"/>
+                      <a:ext cx="5334000" cy="5432647"/>
                     </a:xfrm>
                     <a:prstGeom prst="rect">
                       <a:avLst/>
@@ -5778,7 +5790,7 @@
         <w:t xml:space="preserve"> </w:t>
       </w:r>
       <w:r>
-        <w:t xml:space="preserve">Searching 2,006 projects took 60 ms over HTTP. The algorithm alone took 63 ms for 20,000 projects: an O(n) scan plus an O(k log k) sort of the k matches.</w:t>
+        <w:t xml:space="preserve">Searching 2,006 projects took 87 ms over HTTP (including the MySQL query). The algorithm alone took 112 ms for 20,000 projects: an O(n) scan plus an O(k log k) sort of the k matches.</w:t>
       </w:r>
     </w:p>
     <w:p>
@@ -5827,7 +5839,7 @@
         <w:t xml:space="preserve">”</w:t>
       </w:r>
       <w:r>
-        <w:t xml:space="preserve">, which revealed that the hidden project existed. Pending and rejected projects now return 404, and T12 covers both cases.</w:t>
+        <w:t xml:space="preserve">, which revealed that the hidden project existed. Pending and rejected projects now return 404, and T12 covers both cases. T30 sends two acceptances for the last place at the same moment. Without the row lock it failed 4 out of 5 runs (both were accepted); with the lock it passes every time.</w:t>
       </w:r>
     </w:p>
     <w:p>

</xml_diff>